<commit_message>
Release UGC Flow 1.3.1
</commit_message>
<xml_diff>
--- a/docs/UGC-Flow-API接入说明.docx
+++ b/docs/UGC-Flow-API接入说明.docx
@@ -44,7 +44,7 @@
           <w:color w:val="68727A"/>
           <w:sz w:val="21"/>
         </w:rPr>
-        <w:t>Mac 版 1.3.0  ·  Codex / Claude 智能体 + 图片与视频 API</w:t>
+        <w:t>Mac 版 1.3.1  ·  Codex / Claude 智能体 + 图片与视频 API</w:t>
       </w:r>
     </w:p>
     <w:p>
@@ -64,7 +64,7 @@
           <w:color w:val="20292F"/>
           <w:sz w:val="20"/>
         </w:rPr>
-        <w:t>版本：1.3.0</w:t>
+        <w:t>版本：1.3.1</w:t>
       </w:r>
     </w:p>
     <w:p>

</xml_diff>